<commit_message>
chỉnh sửa lại remote
</commit_message>
<xml_diff>
--- a/read_paper/Parser/Logram.docx
+++ b/read_paper/Parser/Logram.docx
@@ -198,7 +198,13 @@
         <w:pStyle w:val="KCNORMAL"/>
       </w:pPr>
       <w:r>
-        <w:t>+ Trình bày thiết kế chi tiết của phương pháp Logra,  tận dụng từ điển n-gram để đạt được độ chính xác và hiệu suất cao.</w:t>
+        <w:t>+ Trình bày thiết kế chi tiết của phương pháp Logra</w:t>
+      </w:r>
+      <w:r>
+        <w:t>m</w:t>
+      </w:r>
+      <w:r>
+        <w:t>, tận dụng từ điển n-gram để đạt được độ chính xác và hiệu suất cao.</w:t>
       </w:r>
     </w:p>
     <w:p>
@@ -2439,31 +2445,7 @@
           <w:rPr>
             <w:rFonts w:ascii="Cambria Math" w:hAnsi="Cambria Math"/>
           </w:rPr>
-          <m:t>D[i</m:t>
-        </m:r>
-        <m:r>
-          <w:rPr>
-            <w:rFonts w:ascii="Cambria Math" w:hAnsi="Cambria Math"/>
-          </w:rPr>
-          <m:t>-1</m:t>
-        </m:r>
-        <m:r>
-          <w:rPr>
-            <w:rFonts w:ascii="Cambria Math" w:hAnsi="Cambria Math"/>
-          </w:rPr>
-          <m:t>,m</m:t>
-        </m:r>
-        <m:r>
-          <w:rPr>
-            <w:rFonts w:ascii="Cambria Math" w:hAnsi="Cambria Math"/>
-          </w:rPr>
-          <m:t>-1</m:t>
-        </m:r>
-        <m:r>
-          <w:rPr>
-            <w:rFonts w:ascii="Cambria Math" w:hAnsi="Cambria Math"/>
-          </w:rPr>
-          <m:t>]</m:t>
+          <m:t>D[i-1,m-1]</m:t>
         </m:r>
       </m:oMath>
       <w:r>
@@ -3725,13 +3707,7 @@
                 <w:rPr>
                   <w:rFonts w:ascii="Cambria Math" w:hAnsi="Cambria Math"/>
                 </w:rPr>
-                <m:t xml:space="preserve"> </m:t>
-              </m:r>
-              <m:r>
-                <w:rPr>
-                  <w:rFonts w:ascii="Cambria Math" w:hAnsi="Cambria Math"/>
-                </w:rPr>
-                <m:t>μ</m:t>
+                <m:t xml:space="preserve"> μ</m:t>
               </m:r>
             </m:e>
             <m:sub>
@@ -4110,16 +4086,7 @@
                   <w:rPr>
                     <w:rFonts w:ascii="Cambria Math" w:hAnsi="Cambria Math"/>
                   </w:rPr>
-                  <m:t>arg</m:t>
-                </m:r>
-                <m:r>
-                  <m:rPr>
-                    <m:sty m:val="p"/>
-                  </m:rPr>
-                  <w:rPr>
-                    <w:rFonts w:ascii="Cambria Math" w:hAnsi="Cambria Math"/>
-                  </w:rPr>
-                  <m:t>min</m:t>
+                  <m:t>argmin</m:t>
                 </m:r>
               </m:e>
               <m:lim>
@@ -4438,31 +4405,7 @@
           <w:rPr>
             <w:rFonts w:ascii="Cambria Math" w:hAnsi="Cambria Math"/>
           </w:rPr>
-          <m:t>B</m:t>
-        </m:r>
-        <m:r>
-          <w:rPr>
-            <w:rFonts w:ascii="Cambria Math" w:hAnsi="Cambria Math"/>
-          </w:rPr>
-          <m:t>[</m:t>
-        </m:r>
-        <m:r>
-          <w:rPr>
-            <w:rFonts w:ascii="Cambria Math" w:hAnsi="Cambria Math"/>
-          </w:rPr>
-          <m:t>i</m:t>
-        </m:r>
-        <m:r>
-          <w:rPr>
-            <w:rFonts w:ascii="Cambria Math" w:hAnsi="Cambria Math"/>
-          </w:rPr>
-          <m:t>,</m:t>
-        </m:r>
-        <m:r>
-          <w:rPr>
-            <w:rFonts w:ascii="Cambria Math" w:hAnsi="Cambria Math"/>
-          </w:rPr>
-          <m:t>m]</m:t>
+          <m:t>B[i,m]</m:t>
         </m:r>
       </m:oMath>
       <w:r>
@@ -10077,6 +10020,7 @@
   <w:style w:type="character" w:default="1" w:styleId="DefaultParagraphFont">
     <w:name w:val="Default Paragraph Font"/>
     <w:uiPriority w:val="1"/>
+    <w:semiHidden/>
     <w:unhideWhenUsed/>
   </w:style>
   <w:style w:type="table" w:default="1" w:styleId="TableNormal">

</xml_diff>